<commit_message>
Rework manual Section 4 into the 3-scan flow with full-window screenshots
Section 4 now walks through the three scans with full-window screenshots (the
scan pop-up over the live screen) using the sample barcodes: Stuffed Element MO
2220-1321, Assembled Battery MO 2220-1964, and battery label 1964W1261820308.
Machines shown at recipe 1321 to match. Figures renumbered 1-9.

Co-Authored-By: Claude Opus 4.8 <noreply@anthropic.com>
Claude-Session: https://claude.ai/code/session_01BjuTzKQmgMQKVBq6ZrPPMQ
</commit_message>
<xml_diff>
--- a/docs/moreader-operator-manual.docx
+++ b/docs/moreader-operator-manual.docx
@@ -730,49 +730,77 @@
           <w:i w:val="0"/>
           <w:sz w:val="24"/>
         </w:rPr>
-        <w:t>Follow these steps at the start of your shift, or any time the screen says “LOCKED — SCAN MO.”</w:t>
+        <w:t>Do this at the start of your shift, or any time the screen says “LOCKED — SCAN MO.”</w:t>
       </w:r>
     </w:p>
     <w:p>
       <w:pPr>
-        <w:pStyle w:val="ListNumber"/>
+        <w:spacing w:after="120"/>
       </w:pPr>
       <w:r>
-        <w:t>Press the blue VERIFY MO button.</w:t>
+        <w:rPr>
+          <w:b w:val="0"/>
+          <w:i w:val="0"/>
+          <w:sz w:val="24"/>
+        </w:rPr>
+        <w:t>Your line uses three scans. You do them in order. A pop-up opens and guides you. It shows which step you are on, like “Step 1 of 3.”</w:t>
       </w:r>
     </w:p>
     <w:p>
       <w:pPr>
-        <w:pStyle w:val="ListNumber"/>
+        <w:spacing w:after="120"/>
       </w:pPr>
       <w:r>
-        <w:t>A pop-up window opens. It says “SCAN MANUFACTURING ORDER.”</w:t>
+        <w:rPr>
+          <w:b/>
+          <w:i w:val="0"/>
+          <w:sz w:val="24"/>
+        </w:rPr>
+        <w:t>To start, press the blue VERIFY MO button.</w:t>
       </w:r>
     </w:p>
     <w:p>
       <w:pPr>
-        <w:pStyle w:val="ListNumber"/>
+        <w:spacing w:after="120"/>
       </w:pPr>
       <w:r>
-        <w:t>Scan the MO barcode with the scanner. The numbers show in the box.</w:t>
+        <w:rPr>
+          <w:b w:val="0"/>
+          <w:i w:val="0"/>
+          <w:sz w:val="24"/>
+        </w:rPr>
+        <w:t>You never type a number by hand. You only scan.</w:t>
       </w:r>
     </w:p>
     <w:p>
       <w:pPr>
-        <w:pStyle w:val="ListNumber"/>
+        <w:pStyle w:val="Heading2"/>
       </w:pPr>
       <w:r>
-        <w:t>Press OK. (Some scanners do this for you.)</w:t>
+        <w:t>Step 1: Scan the Stuffed Element MO</w:t>
       </w:r>
     </w:p>
     <w:p>
       <w:pPr>
+        <w:spacing w:after="120"/>
+      </w:pPr>
+      <w:r>
+        <w:rPr>
+          <w:b w:val="0"/>
+          <w:i w:val="0"/>
+          <w:sz w:val="24"/>
+        </w:rPr>
+        <w:t>Scan the Stuffed Element MO barcode. In this example it is 2220-1321. The system uses the last 4 numbers (1321) to check each machine.</w:t>
+      </w:r>
+    </w:p>
+    <w:p>
+      <w:pPr>
         <w:jc w:val="center"/>
       </w:pPr>
       <w:r>
         <w:drawing>
           <wp:inline xmlns:a="http://schemas.openxmlformats.org/drawingml/2006/main" xmlns:pic="http://schemas.openxmlformats.org/drawingml/2006/picture">
-            <wp:extent cx="4754880" cy="2500411"/>
+            <wp:extent cx="5943600" cy="4309110"/>
             <wp:docPr id="3" name="Picture 3"/>
             <wp:cNvGraphicFramePr>
               <a:graphicFrameLocks noChangeAspect="1"/>
@@ -781,7 +809,7 @@
               <a:graphicData uri="http://schemas.openxmlformats.org/drawingml/2006/picture">
                 <pic:pic>
                   <pic:nvPicPr>
-                    <pic:cNvPr id="0" name="04_scan_popup.png"/>
+                    <pic:cNvPr id="0" name="08_scan_step1.png"/>
                     <pic:cNvPicPr/>
                   </pic:nvPicPr>
                   <pic:blipFill>
@@ -793,7 +821,7 @@
                   <pic:spPr>
                     <a:xfrm>
                       <a:off x="0" y="0"/>
-                      <a:ext cx="4754880" cy="2500411"/>
+                      <a:ext cx="5943600" cy="4309110"/>
                     </a:xfrm>
                     <a:prstGeom prst="rect"/>
                   </pic:spPr>
@@ -816,20 +844,15 @@
           <w:color w:val="606060"/>
           <w:sz w:val="20"/>
         </w:rPr>
-        <w:t>Figure 3. The scan pop-up. Scan the MO here.</w:t>
+        <w:t>Figure 3. Step 1 of 3 — scan the Stuffed Element MO (2220-1321).</w:t>
       </w:r>
     </w:p>
     <w:p>
       <w:pPr>
-        <w:spacing w:after="120"/>
+        <w:pStyle w:val="Heading2"/>
       </w:pPr>
       <w:r>
-        <w:rPr>
-          <w:b/>
-          <w:i w:val="0"/>
-          <w:sz w:val="24"/>
-        </w:rPr>
-        <w:t>You do not type the number by hand. Just scan it.</w:t>
+        <w:t>Step 2: Scan the Assembled Battery MO</w:t>
       </w:r>
     </w:p>
     <w:p>
@@ -842,7 +865,7 @@
           <w:i w:val="0"/>
           <w:sz w:val="24"/>
         </w:rPr>
-        <w:t>If the scan is good, the boxes turn green and the master box says “MO VERIFIED.” The line can now run.</w:t>
+        <w:t>Next, scan the Assembled Battery MO barcode. In this example it is 2220-1964. This is a different order than Step 1.</w:t>
       </w:r>
     </w:p>
     <w:p>
@@ -861,7 +884,7 @@
               <a:graphicData uri="http://schemas.openxmlformats.org/drawingml/2006/picture">
                 <pic:pic>
                   <pic:nvPicPr>
-                    <pic:cNvPr id="0" name="02_main_verified.png"/>
+                    <pic:cNvPr id="0" name="09_scan_step2.png"/>
                     <pic:cNvPicPr/>
                   </pic:nvPicPr>
                   <pic:blipFill>
@@ -896,7 +919,170 @@
           <w:color w:val="606060"/>
           <w:sz w:val="20"/>
         </w:rPr>
-        <w:t>Figure 4. A good scan. All boxes are green.</w:t>
+        <w:t>Figure 4. Step 2 of 3 — scan the Assembled Battery MO (2220-1964).</w:t>
+      </w:r>
+    </w:p>
+    <w:p>
+      <w:pPr>
+        <w:pStyle w:val="Heading2"/>
+      </w:pPr>
+      <w:r>
+        <w:t>Step 3: Scan the Battery Label</w:t>
+      </w:r>
+    </w:p>
+    <w:p>
+      <w:pPr>
+        <w:spacing w:after="120"/>
+      </w:pPr>
+      <w:r>
+        <w:rPr>
+          <w:b w:val="0"/>
+          <w:i w:val="0"/>
+          <w:sz w:val="24"/>
+        </w:rPr>
+        <w:t>Last, scan the battery label barcode. In this example it is 1964W1261820308. The first 4 numbers (1964) must match the Assembled Battery MO from Step 2.</w:t>
+      </w:r>
+    </w:p>
+    <w:p>
+      <w:pPr>
+        <w:jc w:val="center"/>
+      </w:pPr>
+      <w:r>
+        <w:drawing>
+          <wp:inline xmlns:a="http://schemas.openxmlformats.org/drawingml/2006/main" xmlns:pic="http://schemas.openxmlformats.org/drawingml/2006/picture">
+            <wp:extent cx="5943600" cy="4309110"/>
+            <wp:docPr id="5" name="Picture 5"/>
+            <wp:cNvGraphicFramePr>
+              <a:graphicFrameLocks noChangeAspect="1"/>
+            </wp:cNvGraphicFramePr>
+            <a:graphic>
+              <a:graphicData uri="http://schemas.openxmlformats.org/drawingml/2006/picture">
+                <pic:pic>
+                  <pic:nvPicPr>
+                    <pic:cNvPr id="0" name="10_scan_step3.png"/>
+                    <pic:cNvPicPr/>
+                  </pic:nvPicPr>
+                  <pic:blipFill>
+                    <a:blip r:embed="rId13"/>
+                    <a:stretch>
+                      <a:fillRect/>
+                    </a:stretch>
+                  </pic:blipFill>
+                  <pic:spPr>
+                    <a:xfrm>
+                      <a:off x="0" y="0"/>
+                      <a:ext cx="5943600" cy="4309110"/>
+                    </a:xfrm>
+                    <a:prstGeom prst="rect"/>
+                  </pic:spPr>
+                </pic:pic>
+              </a:graphicData>
+            </a:graphic>
+          </wp:inline>
+        </w:drawing>
+      </w:r>
+    </w:p>
+    <w:p>
+      <w:pPr>
+        <w:spacing w:after="240"/>
+        <w:jc w:val="center"/>
+      </w:pPr>
+      <w:r>
+        <w:rPr>
+          <w:b w:val="0"/>
+          <w:i/>
+          <w:color w:val="606060"/>
+          <w:sz w:val="20"/>
+        </w:rPr>
+        <w:t>Figure 5. Step 3 of 3 — scan the battery label (1964W1261820308).</w:t>
+      </w:r>
+    </w:p>
+    <w:p>
+      <w:pPr>
+        <w:pStyle w:val="Heading2"/>
+      </w:pPr>
+      <w:r>
+        <w:t>When You Are Done</w:t>
+      </w:r>
+    </w:p>
+    <w:p>
+      <w:pPr>
+        <w:spacing w:after="120"/>
+      </w:pPr>
+      <w:r>
+        <w:rPr>
+          <w:b w:val="0"/>
+          <w:i w:val="0"/>
+          <w:sz w:val="24"/>
+        </w:rPr>
+        <w:t>After the last scan, press OK. Some scanners do this for you.</w:t>
+      </w:r>
+    </w:p>
+    <w:p>
+      <w:pPr>
+        <w:spacing w:after="120"/>
+      </w:pPr>
+      <w:r>
+        <w:rPr>
+          <w:b w:val="0"/>
+          <w:i w:val="0"/>
+          <w:sz w:val="24"/>
+        </w:rPr>
+        <w:t>If everything matches, the machine boxes turn green. The master box says “MO VERIFIED.” The line can now run.</w:t>
+      </w:r>
+    </w:p>
+    <w:p>
+      <w:pPr>
+        <w:jc w:val="center"/>
+      </w:pPr>
+      <w:r>
+        <w:drawing>
+          <wp:inline xmlns:a="http://schemas.openxmlformats.org/drawingml/2006/main" xmlns:pic="http://schemas.openxmlformats.org/drawingml/2006/picture">
+            <wp:extent cx="5943600" cy="4309110"/>
+            <wp:docPr id="6" name="Picture 6"/>
+            <wp:cNvGraphicFramePr>
+              <a:graphicFrameLocks noChangeAspect="1"/>
+            </wp:cNvGraphicFramePr>
+            <a:graphic>
+              <a:graphicData uri="http://schemas.openxmlformats.org/drawingml/2006/picture">
+                <pic:pic>
+                  <pic:nvPicPr>
+                    <pic:cNvPr id="0" name="02_main_verified.png"/>
+                    <pic:cNvPicPr/>
+                  </pic:nvPicPr>
+                  <pic:blipFill>
+                    <a:blip r:embed="rId14"/>
+                    <a:stretch>
+                      <a:fillRect/>
+                    </a:stretch>
+                  </pic:blipFill>
+                  <pic:spPr>
+                    <a:xfrm>
+                      <a:off x="0" y="0"/>
+                      <a:ext cx="5943600" cy="4309110"/>
+                    </a:xfrm>
+                    <a:prstGeom prst="rect"/>
+                  </pic:spPr>
+                </pic:pic>
+              </a:graphicData>
+            </a:graphic>
+          </wp:inline>
+        </w:drawing>
+      </w:r>
+    </w:p>
+    <w:p>
+      <w:pPr>
+        <w:spacing w:after="240"/>
+        <w:jc w:val="center"/>
+      </w:pPr>
+      <w:r>
+        <w:rPr>
+          <w:b w:val="0"/>
+          <w:i/>
+          <w:color w:val="606060"/>
+          <w:sz w:val="20"/>
+        </w:rPr>
+        <w:t>Figure 6. All three scans passed. The line is ready.</w:t>
       </w:r>
     </w:p>
     <w:p>
@@ -909,57 +1095,31 @@
           <w:i w:val="0"/>
           <w:sz w:val="24"/>
         </w:rPr>
-        <w:t>If your line uses a battery label:</w:t>
+        <w:t>Remember:</w:t>
       </w:r>
     </w:p>
     <w:p>
       <w:pPr>
-        <w:spacing w:after="120"/>
+        <w:pStyle w:val="ListBullet"/>
       </w:pPr>
       <w:r>
-        <w:rPr>
-          <w:b w:val="0"/>
-          <w:i w:val="0"/>
-          <w:sz w:val="24"/>
-        </w:rPr>
-        <w:t>Some lines need two more scans. The pop-up will guide you step by step:</w:t>
+        <w:t>Scan in order: Stuffed Element, then Assembled Battery, then battery label.</w:t>
       </w:r>
     </w:p>
     <w:p>
       <w:pPr>
-        <w:pStyle w:val="ListNumber"/>
+        <w:pStyle w:val="ListBullet"/>
       </w:pPr>
       <w:r>
-        <w:t>Scan the Stuffed Element MO.</w:t>
+        <w:t>You only scan. You do not type any number.</w:t>
       </w:r>
     </w:p>
     <w:p>
       <w:pPr>
-        <w:pStyle w:val="ListNumber"/>
+        <w:pStyle w:val="ListBullet"/>
       </w:pPr>
       <w:r>
-        <w:t>Scan the Assembled Battery MO.</w:t>
-      </w:r>
-    </w:p>
-    <w:p>
-      <w:pPr>
-        <w:pStyle w:val="ListNumber"/>
-      </w:pPr>
-      <w:r>
-        <w:t>Scan the battery label.</w:t>
-      </w:r>
-    </w:p>
-    <w:p>
-      <w:pPr>
-        <w:spacing w:after="120"/>
-      </w:pPr>
-      <w:r>
-        <w:rPr>
-          <w:b w:val="0"/>
-          <w:i w:val="0"/>
-          <w:sz w:val="24"/>
-        </w:rPr>
-        <w:t>The battery label must match the Assembled Battery MO. The pop-up tells you which step you are on (for example, “Step 2 of 3”).</w:t>
+        <w:t>If any scan does not match, a red screen tells you what is wrong. See Section 5.</w:t>
       </w:r>
     </w:p>
     <w:p>
@@ -991,7 +1151,7 @@
         <w:drawing>
           <wp:inline xmlns:a="http://schemas.openxmlformats.org/drawingml/2006/main" xmlns:pic="http://schemas.openxmlformats.org/drawingml/2006/picture">
             <wp:extent cx="5029200" cy="2553891"/>
-            <wp:docPr id="5" name="Picture 5"/>
+            <wp:docPr id="7" name="Picture 7"/>
             <wp:cNvGraphicFramePr>
               <a:graphicFrameLocks noChangeAspect="1"/>
             </wp:cNvGraphicFramePr>
@@ -1003,7 +1163,7 @@
                     <pic:cNvPicPr/>
                   </pic:nvPicPr>
                   <pic:blipFill>
-                    <a:blip r:embed="rId13"/>
+                    <a:blip r:embed="rId15"/>
                     <a:stretch>
                       <a:fillRect/>
                     </a:stretch>
@@ -1034,7 +1194,7 @@
           <w:color w:val="606060"/>
           <w:sz w:val="20"/>
         </w:rPr>
-        <w:t>Figure 5. The error screen shows the reason.</w:t>
+        <w:t>Figure 7. The error screen shows the reason.</w:t>
       </w:r>
     </w:p>
     <w:p>
@@ -1148,7 +1308,7 @@
         <w:drawing>
           <wp:inline xmlns:a="http://schemas.openxmlformats.org/drawingml/2006/main" xmlns:pic="http://schemas.openxmlformats.org/drawingml/2006/picture">
             <wp:extent cx="4206240" cy="1115568"/>
-            <wp:docPr id="6" name="Picture 6"/>
+            <wp:docPr id="8" name="Picture 8"/>
             <wp:cNvGraphicFramePr>
               <a:graphicFrameLocks noChangeAspect="1"/>
             </wp:cNvGraphicFramePr>
@@ -1160,7 +1320,7 @@
                     <pic:cNvPicPr/>
                   </pic:nvPicPr>
                   <pic:blipFill>
-                    <a:blip r:embed="rId14"/>
+                    <a:blip r:embed="rId16"/>
                     <a:stretch>
                       <a:fillRect/>
                     </a:stretch>
@@ -1191,7 +1351,7 @@
           <w:color w:val="606060"/>
           <w:sz w:val="20"/>
         </w:rPr>
-        <w:t>Figure 6. Bypass asks for a password.</w:t>
+        <w:t>Figure 8. Bypass asks for a password.</w:t>
       </w:r>
     </w:p>
     <w:p>
@@ -1215,7 +1375,7 @@
         <w:drawing>
           <wp:inline xmlns:a="http://schemas.openxmlformats.org/drawingml/2006/main" xmlns:pic="http://schemas.openxmlformats.org/drawingml/2006/picture">
             <wp:extent cx="5943600" cy="4309110"/>
-            <wp:docPr id="7" name="Picture 7"/>
+            <wp:docPr id="9" name="Picture 9"/>
             <wp:cNvGraphicFramePr>
               <a:graphicFrameLocks noChangeAspect="1"/>
             </wp:cNvGraphicFramePr>
@@ -1227,7 +1387,7 @@
                     <pic:cNvPicPr/>
                   </pic:nvPicPr>
                   <pic:blipFill>
-                    <a:blip r:embed="rId15"/>
+                    <a:blip r:embed="rId17"/>
                     <a:stretch>
                       <a:fillRect/>
                     </a:stretch>
@@ -1258,7 +1418,7 @@
           <w:color w:val="606060"/>
           <w:sz w:val="20"/>
         </w:rPr>
-        <w:t>Figure 7. Bypass is on. The master box is purple.</w:t>
+        <w:t>Figure 9. Bypass is on. The master box is purple.</w:t>
       </w:r>
     </w:p>
     <w:p>

</xml_diff>